<commit_message>
Making Final Push to upload
</commit_message>
<xml_diff>
--- a/Documentation/Software Engineering.docx
+++ b/Documentation/Software Engineering.docx
@@ -147,7 +147,19 @@
         <w:rPr>
           <w:rFonts w:ascii="Times New Roman" w:hAnsi="Times New Roman" w:cs="Times New Roman"/>
         </w:rPr>
-        <w:t>[Word Count: ~~~~]</w:t>
+        <w:t>[Word Count: </w:t>
+      </w:r>
+      <w:r>
+        <w:rPr>
+          <w:rFonts w:ascii="Times New Roman" w:hAnsi="Times New Roman" w:cs="Times New Roman"/>
+        </w:rPr>
+        <w:t>967</w:t>
+      </w:r>
+      <w:r>
+        <w:rPr>
+          <w:rFonts w:ascii="Times New Roman" w:hAnsi="Times New Roman" w:cs="Times New Roman"/>
+        </w:rPr>
+        <w:t>]</w:t>
       </w:r>
     </w:p>
     <w:p>
@@ -433,10 +445,11 @@
           <w:pPr>
             <w:pStyle w:val="TOC1"/>
             <w:tabs>
+              <w:tab w:val="left" w:pos="440"/>
               <w:tab w:val="right" w:leader="dot" w:pos="9016"/>
             </w:tabs>
             <w:rPr>
-              <w:rFonts w:ascii="Times New Roman" w:hAnsi="Times New Roman"/>
+              <w:rFonts w:cstheme="minorBidi"/>
               <w:noProof/>
               <w:kern w:val="2"/>
               <w:sz w:val="24"/>
@@ -462,26 +475,43 @@
             </w:rPr>
             <w:fldChar w:fldCharType="separate"/>
           </w:r>
-          <w:hyperlink w:anchor="_Toc225434890" w:history="1">
+          <w:hyperlink w:anchor="_Toc225443454" w:history="1">
             <w:r>
               <w:rPr>
                 <w:rStyle w:val="Hyperlink"/>
                 <w:rFonts w:ascii="Times New Roman" w:hAnsi="Times New Roman"/>
                 <w:noProof/>
               </w:rPr>
-              <w:t>1. Introduction</w:t>
-            </w:r>
-            <w:r>
-              <w:rPr>
+              <w:t>1.</w:t>
+            </w:r>
+            <w:r>
+              <w:rPr>
+                <w:rFonts w:cstheme="minorBidi"/>
+                <w:noProof/>
+                <w:kern w:val="2"/>
+                <w:sz w:val="24"/>
+                <w:szCs w:val="24"/>
+                <w14:ligatures w14:val="standardContextual"/>
+              </w:rPr>
+              <w:tab/>
+            </w:r>
+            <w:r>
+              <w:rPr>
+                <w:rStyle w:val="Hyperlink"/>
                 <w:rFonts w:ascii="Times New Roman" w:hAnsi="Times New Roman"/>
                 <w:noProof/>
+              </w:rPr>
+              <w:t>Introduction</w:t>
+            </w:r>
+            <w:r>
+              <w:rPr>
+                <w:noProof/>
                 <w:webHidden/>
               </w:rPr>
               <w:tab/>
             </w:r>
             <w:r>
               <w:rPr>
-                <w:rFonts w:ascii="Times New Roman" w:hAnsi="Times New Roman"/>
                 <w:noProof/>
                 <w:webHidden/>
               </w:rPr>
@@ -489,22 +519,19 @@
             </w:r>
             <w:r>
               <w:rPr>
-                <w:rFonts w:ascii="Times New Roman" w:hAnsi="Times New Roman"/>
                 <w:noProof/>
                 <w:webHidden/>
               </w:rPr>
-              <w:instrText xml:space="preserve"> PAGEREF _Toc225434890 \h </w:instrText>
-            </w:r>
-            <w:r>
-              <w:rPr>
-                <w:rFonts w:ascii="Times New Roman" w:hAnsi="Times New Roman"/>
+              <w:instrText xml:space="preserve"> PAGEREF _Toc225443454 \h </w:instrText>
+            </w:r>
+            <w:r>
+              <w:rPr>
                 <w:noProof/>
                 <w:webHidden/>
               </w:rPr>
             </w:r>
             <w:r>
               <w:rPr>
-                <w:rFonts w:ascii="Times New Roman" w:hAnsi="Times New Roman"/>
                 <w:noProof/>
                 <w:webHidden/>
               </w:rPr>
@@ -512,7 +539,6 @@
             </w:r>
             <w:r>
               <w:rPr>
-                <w:rFonts w:ascii="Times New Roman" w:hAnsi="Times New Roman"/>
                 <w:noProof/>
                 <w:webHidden/>
               </w:rPr>
@@ -520,7 +546,6 @@
             </w:r>
             <w:r>
               <w:rPr>
-                <w:rFonts w:ascii="Times New Roman" w:hAnsi="Times New Roman"/>
                 <w:noProof/>
                 <w:webHidden/>
               </w:rPr>
@@ -532,10 +557,11 @@
           <w:pPr>
             <w:pStyle w:val="TOC1"/>
             <w:tabs>
+              <w:tab w:val="left" w:pos="440"/>
               <w:tab w:val="right" w:leader="dot" w:pos="9016"/>
             </w:tabs>
             <w:rPr>
-              <w:rFonts w:ascii="Times New Roman" w:hAnsi="Times New Roman"/>
+              <w:rFonts w:cstheme="minorBidi"/>
               <w:noProof/>
               <w:kern w:val="2"/>
               <w:sz w:val="24"/>
@@ -543,7 +569,7 @@
               <w14:ligatures w14:val="standardContextual"/>
             </w:rPr>
           </w:pPr>
-          <w:hyperlink w:anchor="_Toc225434891" w:history="1">
+          <w:hyperlink w:anchor="_Toc225443455" w:history="1">
             <w:r>
               <w:rPr>
                 <w:rStyle w:val="Hyperlink"/>
@@ -551,19 +577,37 @@
                 <w:noProof/>
                 <w:lang w:val="en-US"/>
               </w:rPr>
-              <w:t>2. Project Overview</w:t>
-            </w:r>
-            <w:r>
-              <w:rPr>
+              <w:t>2.</w:t>
+            </w:r>
+            <w:r>
+              <w:rPr>
+                <w:rFonts w:cstheme="minorBidi"/>
+                <w:noProof/>
+                <w:kern w:val="2"/>
+                <w:sz w:val="24"/>
+                <w:szCs w:val="24"/>
+                <w14:ligatures w14:val="standardContextual"/>
+              </w:rPr>
+              <w:tab/>
+            </w:r>
+            <w:r>
+              <w:rPr>
+                <w:rStyle w:val="Hyperlink"/>
                 <w:rFonts w:ascii="Times New Roman" w:hAnsi="Times New Roman"/>
                 <w:noProof/>
+                <w:lang w:val="en-US"/>
+              </w:rPr>
+              <w:t>Project Overview</w:t>
+            </w:r>
+            <w:r>
+              <w:rPr>
+                <w:noProof/>
                 <w:webHidden/>
               </w:rPr>
               <w:tab/>
             </w:r>
             <w:r>
               <w:rPr>
-                <w:rFonts w:ascii="Times New Roman" w:hAnsi="Times New Roman"/>
                 <w:noProof/>
                 <w:webHidden/>
               </w:rPr>
@@ -571,22 +615,19 @@
             </w:r>
             <w:r>
               <w:rPr>
-                <w:rFonts w:ascii="Times New Roman" w:hAnsi="Times New Roman"/>
                 <w:noProof/>
                 <w:webHidden/>
               </w:rPr>
-              <w:instrText xml:space="preserve"> PAGEREF _Toc225434891 \h </w:instrText>
-            </w:r>
-            <w:r>
-              <w:rPr>
-                <w:rFonts w:ascii="Times New Roman" w:hAnsi="Times New Roman"/>
+              <w:instrText xml:space="preserve"> PAGEREF _Toc225443455 \h </w:instrText>
+            </w:r>
+            <w:r>
+              <w:rPr>
                 <w:noProof/>
                 <w:webHidden/>
               </w:rPr>
             </w:r>
             <w:r>
               <w:rPr>
-                <w:rFonts w:ascii="Times New Roman" w:hAnsi="Times New Roman"/>
                 <w:noProof/>
                 <w:webHidden/>
               </w:rPr>
@@ -594,7 +635,6 @@
             </w:r>
             <w:r>
               <w:rPr>
-                <w:rFonts w:ascii="Times New Roman" w:hAnsi="Times New Roman"/>
                 <w:noProof/>
                 <w:webHidden/>
               </w:rPr>
@@ -602,7 +642,6 @@
             </w:r>
             <w:r>
               <w:rPr>
-                <w:rFonts w:ascii="Times New Roman" w:hAnsi="Times New Roman"/>
                 <w:noProof/>
                 <w:webHidden/>
               </w:rPr>
@@ -614,10 +653,11 @@
           <w:pPr>
             <w:pStyle w:val="TOC1"/>
             <w:tabs>
+              <w:tab w:val="left" w:pos="440"/>
               <w:tab w:val="right" w:leader="dot" w:pos="9016"/>
             </w:tabs>
             <w:rPr>
-              <w:rFonts w:ascii="Times New Roman" w:hAnsi="Times New Roman"/>
+              <w:rFonts w:cstheme="minorBidi"/>
               <w:noProof/>
               <w:kern w:val="2"/>
               <w:sz w:val="24"/>
@@ -625,7 +665,7 @@
               <w14:ligatures w14:val="standardContextual"/>
             </w:rPr>
           </w:pPr>
-          <w:hyperlink w:anchor="_Toc225434892" w:history="1">
+          <w:hyperlink w:anchor="_Toc225443456" w:history="1">
             <w:r>
               <w:rPr>
                 <w:rStyle w:val="Hyperlink"/>
@@ -633,19 +673,37 @@
                 <w:noProof/>
                 <w:lang w:val="en-US"/>
               </w:rPr>
-              <w:t>3. Project Management</w:t>
-            </w:r>
-            <w:r>
-              <w:rPr>
+              <w:t>3.</w:t>
+            </w:r>
+            <w:r>
+              <w:rPr>
+                <w:rFonts w:cstheme="minorBidi"/>
+                <w:noProof/>
+                <w:kern w:val="2"/>
+                <w:sz w:val="24"/>
+                <w:szCs w:val="24"/>
+                <w14:ligatures w14:val="standardContextual"/>
+              </w:rPr>
+              <w:tab/>
+            </w:r>
+            <w:r>
+              <w:rPr>
+                <w:rStyle w:val="Hyperlink"/>
                 <w:rFonts w:ascii="Times New Roman" w:hAnsi="Times New Roman"/>
                 <w:noProof/>
+                <w:lang w:val="en-US"/>
+              </w:rPr>
+              <w:t>Project Management</w:t>
+            </w:r>
+            <w:r>
+              <w:rPr>
+                <w:noProof/>
                 <w:webHidden/>
               </w:rPr>
               <w:tab/>
             </w:r>
             <w:r>
               <w:rPr>
-                <w:rFonts w:ascii="Times New Roman" w:hAnsi="Times New Roman"/>
                 <w:noProof/>
                 <w:webHidden/>
               </w:rPr>
@@ -653,22 +711,19 @@
             </w:r>
             <w:r>
               <w:rPr>
-                <w:rFonts w:ascii="Times New Roman" w:hAnsi="Times New Roman"/>
                 <w:noProof/>
                 <w:webHidden/>
               </w:rPr>
-              <w:instrText xml:space="preserve"> PAGEREF _Toc225434892 \h </w:instrText>
-            </w:r>
-            <w:r>
-              <w:rPr>
-                <w:rFonts w:ascii="Times New Roman" w:hAnsi="Times New Roman"/>
+              <w:instrText xml:space="preserve"> PAGEREF _Toc225443456 \h </w:instrText>
+            </w:r>
+            <w:r>
+              <w:rPr>
                 <w:noProof/>
                 <w:webHidden/>
               </w:rPr>
             </w:r>
             <w:r>
               <w:rPr>
-                <w:rFonts w:ascii="Times New Roman" w:hAnsi="Times New Roman"/>
                 <w:noProof/>
                 <w:webHidden/>
               </w:rPr>
@@ -676,7 +731,6 @@
             </w:r>
             <w:r>
               <w:rPr>
-                <w:rFonts w:ascii="Times New Roman" w:hAnsi="Times New Roman"/>
                 <w:noProof/>
                 <w:webHidden/>
               </w:rPr>
@@ -684,7 +738,6 @@
             </w:r>
             <w:r>
               <w:rPr>
-                <w:rFonts w:ascii="Times New Roman" w:hAnsi="Times New Roman"/>
                 <w:noProof/>
                 <w:webHidden/>
               </w:rPr>
@@ -699,7 +752,7 @@
               <w:tab w:val="right" w:leader="dot" w:pos="9016"/>
             </w:tabs>
             <w:rPr>
-              <w:rFonts w:ascii="Times New Roman" w:hAnsi="Times New Roman"/>
+              <w:rFonts w:cstheme="minorBidi"/>
               <w:noProof/>
               <w:kern w:val="2"/>
               <w:sz w:val="24"/>
@@ -707,7 +760,7 @@
               <w14:ligatures w14:val="standardContextual"/>
             </w:rPr>
           </w:pPr>
-          <w:hyperlink w:anchor="_Toc225434893" w:history="1">
+          <w:hyperlink w:anchor="_Toc225443457" w:history="1">
             <w:r>
               <w:rPr>
                 <w:rStyle w:val="Hyperlink"/>
@@ -719,7 +772,6 @@
             </w:r>
             <w:r>
               <w:rPr>
-                <w:rFonts w:ascii="Times New Roman" w:hAnsi="Times New Roman"/>
                 <w:noProof/>
                 <w:webHidden/>
               </w:rPr>
@@ -727,7 +779,6 @@
             </w:r>
             <w:r>
               <w:rPr>
-                <w:rFonts w:ascii="Times New Roman" w:hAnsi="Times New Roman"/>
                 <w:noProof/>
                 <w:webHidden/>
               </w:rPr>
@@ -735,22 +786,19 @@
             </w:r>
             <w:r>
               <w:rPr>
-                <w:rFonts w:ascii="Times New Roman" w:hAnsi="Times New Roman"/>
                 <w:noProof/>
                 <w:webHidden/>
               </w:rPr>
-              <w:instrText xml:space="preserve"> PAGEREF _Toc225434893 \h </w:instrText>
-            </w:r>
-            <w:r>
-              <w:rPr>
-                <w:rFonts w:ascii="Times New Roman" w:hAnsi="Times New Roman"/>
+              <w:instrText xml:space="preserve"> PAGEREF _Toc225443457 \h </w:instrText>
+            </w:r>
+            <w:r>
+              <w:rPr>
                 <w:noProof/>
                 <w:webHidden/>
               </w:rPr>
             </w:r>
             <w:r>
               <w:rPr>
-                <w:rFonts w:ascii="Times New Roman" w:hAnsi="Times New Roman"/>
                 <w:noProof/>
                 <w:webHidden/>
               </w:rPr>
@@ -758,7 +806,6 @@
             </w:r>
             <w:r>
               <w:rPr>
-                <w:rFonts w:ascii="Times New Roman" w:hAnsi="Times New Roman"/>
                 <w:noProof/>
                 <w:webHidden/>
               </w:rPr>
@@ -766,7 +813,6 @@
             </w:r>
             <w:r>
               <w:rPr>
-                <w:rFonts w:ascii="Times New Roman" w:hAnsi="Times New Roman"/>
                 <w:noProof/>
                 <w:webHidden/>
               </w:rPr>
@@ -778,10 +824,11 @@
           <w:pPr>
             <w:pStyle w:val="TOC1"/>
             <w:tabs>
+              <w:tab w:val="left" w:pos="440"/>
               <w:tab w:val="right" w:leader="dot" w:pos="9016"/>
             </w:tabs>
             <w:rPr>
-              <w:rFonts w:ascii="Times New Roman" w:hAnsi="Times New Roman"/>
+              <w:rFonts w:cstheme="minorBidi"/>
               <w:noProof/>
               <w:kern w:val="2"/>
               <w:sz w:val="24"/>
@@ -789,7 +836,7 @@
               <w14:ligatures w14:val="standardContextual"/>
             </w:rPr>
           </w:pPr>
-          <w:hyperlink w:anchor="_Toc225434894" w:history="1">
+          <w:hyperlink w:anchor="_Toc225443458" w:history="1">
             <w:r>
               <w:rPr>
                 <w:rStyle w:val="Hyperlink"/>
@@ -797,19 +844,37 @@
                 <w:noProof/>
                 <w:lang w:val="en-US"/>
               </w:rPr>
-              <w:t>4. Requirement Gathering</w:t>
-            </w:r>
-            <w:r>
-              <w:rPr>
+              <w:t>4.</w:t>
+            </w:r>
+            <w:r>
+              <w:rPr>
+                <w:rFonts w:cstheme="minorBidi"/>
+                <w:noProof/>
+                <w:kern w:val="2"/>
+                <w:sz w:val="24"/>
+                <w:szCs w:val="24"/>
+                <w14:ligatures w14:val="standardContextual"/>
+              </w:rPr>
+              <w:tab/>
+            </w:r>
+            <w:r>
+              <w:rPr>
+                <w:rStyle w:val="Hyperlink"/>
                 <w:rFonts w:ascii="Times New Roman" w:hAnsi="Times New Roman"/>
                 <w:noProof/>
+                <w:lang w:val="en-US"/>
+              </w:rPr>
+              <w:t>Requirement Gathering</w:t>
+            </w:r>
+            <w:r>
+              <w:rPr>
+                <w:noProof/>
                 <w:webHidden/>
               </w:rPr>
               <w:tab/>
             </w:r>
             <w:r>
               <w:rPr>
-                <w:rFonts w:ascii="Times New Roman" w:hAnsi="Times New Roman"/>
                 <w:noProof/>
                 <w:webHidden/>
               </w:rPr>
@@ -817,22 +882,19 @@
             </w:r>
             <w:r>
               <w:rPr>
-                <w:rFonts w:ascii="Times New Roman" w:hAnsi="Times New Roman"/>
                 <w:noProof/>
                 <w:webHidden/>
               </w:rPr>
-              <w:instrText xml:space="preserve"> PAGEREF _Toc225434894 \h </w:instrText>
-            </w:r>
-            <w:r>
-              <w:rPr>
-                <w:rFonts w:ascii="Times New Roman" w:hAnsi="Times New Roman"/>
+              <w:instrText xml:space="preserve"> PAGEREF _Toc225443458 \h </w:instrText>
+            </w:r>
+            <w:r>
+              <w:rPr>
                 <w:noProof/>
                 <w:webHidden/>
               </w:rPr>
             </w:r>
             <w:r>
               <w:rPr>
-                <w:rFonts w:ascii="Times New Roman" w:hAnsi="Times New Roman"/>
                 <w:noProof/>
                 <w:webHidden/>
               </w:rPr>
@@ -840,15 +902,13 @@
             </w:r>
             <w:r>
               <w:rPr>
-                <w:rFonts w:ascii="Times New Roman" w:hAnsi="Times New Roman"/>
                 <w:noProof/>
                 <w:webHidden/>
               </w:rPr>
-              <w:t>3</w:t>
-            </w:r>
-            <w:r>
-              <w:rPr>
-                <w:rFonts w:ascii="Times New Roman" w:hAnsi="Times New Roman"/>
+              <w:t>4</w:t>
+            </w:r>
+            <w:r>
+              <w:rPr>
                 <w:noProof/>
                 <w:webHidden/>
               </w:rPr>
@@ -863,7 +923,7 @@
               <w:tab w:val="right" w:leader="dot" w:pos="9016"/>
             </w:tabs>
             <w:rPr>
-              <w:rFonts w:ascii="Times New Roman" w:hAnsi="Times New Roman"/>
+              <w:rFonts w:cstheme="minorBidi"/>
               <w:noProof/>
               <w:kern w:val="2"/>
               <w:sz w:val="24"/>
@@ -871,7 +931,7 @@
               <w14:ligatures w14:val="standardContextual"/>
             </w:rPr>
           </w:pPr>
-          <w:hyperlink w:anchor="_Toc225434895" w:history="1">
+          <w:hyperlink w:anchor="_Toc225443459" w:history="1">
             <w:r>
               <w:rPr>
                 <w:rStyle w:val="Hyperlink"/>
@@ -883,7 +943,6 @@
             </w:r>
             <w:r>
               <w:rPr>
-                <w:rFonts w:ascii="Times New Roman" w:hAnsi="Times New Roman"/>
                 <w:noProof/>
                 <w:webHidden/>
               </w:rPr>
@@ -891,7 +950,6 @@
             </w:r>
             <w:r>
               <w:rPr>
-                <w:rFonts w:ascii="Times New Roman" w:hAnsi="Times New Roman"/>
                 <w:noProof/>
                 <w:webHidden/>
               </w:rPr>
@@ -899,22 +957,19 @@
             </w:r>
             <w:r>
               <w:rPr>
-                <w:rFonts w:ascii="Times New Roman" w:hAnsi="Times New Roman"/>
                 <w:noProof/>
                 <w:webHidden/>
               </w:rPr>
-              <w:instrText xml:space="preserve"> PAGEREF _Toc225434895 \h </w:instrText>
-            </w:r>
-            <w:r>
-              <w:rPr>
-                <w:rFonts w:ascii="Times New Roman" w:hAnsi="Times New Roman"/>
+              <w:instrText xml:space="preserve"> PAGEREF _Toc225443459 \h </w:instrText>
+            </w:r>
+            <w:r>
+              <w:rPr>
                 <w:noProof/>
                 <w:webHidden/>
               </w:rPr>
             </w:r>
             <w:r>
               <w:rPr>
-                <w:rFonts w:ascii="Times New Roman" w:hAnsi="Times New Roman"/>
                 <w:noProof/>
                 <w:webHidden/>
               </w:rPr>
@@ -922,15 +977,13 @@
             </w:r>
             <w:r>
               <w:rPr>
-                <w:rFonts w:ascii="Times New Roman" w:hAnsi="Times New Roman"/>
                 <w:noProof/>
                 <w:webHidden/>
               </w:rPr>
-              <w:t>3</w:t>
-            </w:r>
-            <w:r>
-              <w:rPr>
-                <w:rFonts w:ascii="Times New Roman" w:hAnsi="Times New Roman"/>
+              <w:t>4</w:t>
+            </w:r>
+            <w:r>
+              <w:rPr>
                 <w:noProof/>
                 <w:webHidden/>
               </w:rPr>
@@ -942,10 +995,11 @@
           <w:pPr>
             <w:pStyle w:val="TOC1"/>
             <w:tabs>
+              <w:tab w:val="left" w:pos="440"/>
               <w:tab w:val="right" w:leader="dot" w:pos="9016"/>
             </w:tabs>
             <w:rPr>
-              <w:rFonts w:ascii="Times New Roman" w:hAnsi="Times New Roman"/>
+              <w:rFonts w:cstheme="minorBidi"/>
               <w:noProof/>
               <w:kern w:val="2"/>
               <w:sz w:val="24"/>
@@ -953,7 +1007,7 @@
               <w14:ligatures w14:val="standardContextual"/>
             </w:rPr>
           </w:pPr>
-          <w:hyperlink w:anchor="_Toc225434896" w:history="1">
+          <w:hyperlink w:anchor="_Toc225443460" w:history="1">
             <w:r>
               <w:rPr>
                 <w:rStyle w:val="Hyperlink"/>
@@ -961,19 +1015,37 @@
                 <w:noProof/>
                 <w:lang w:val="en-US"/>
               </w:rPr>
-              <w:t>5. Design</w:t>
-            </w:r>
-            <w:r>
-              <w:rPr>
+              <w:t>5.</w:t>
+            </w:r>
+            <w:r>
+              <w:rPr>
+                <w:rFonts w:cstheme="minorBidi"/>
+                <w:noProof/>
+                <w:kern w:val="2"/>
+                <w:sz w:val="24"/>
+                <w:szCs w:val="24"/>
+                <w14:ligatures w14:val="standardContextual"/>
+              </w:rPr>
+              <w:tab/>
+            </w:r>
+            <w:r>
+              <w:rPr>
+                <w:rStyle w:val="Hyperlink"/>
                 <w:rFonts w:ascii="Times New Roman" w:hAnsi="Times New Roman"/>
                 <w:noProof/>
+                <w:lang w:val="en-US"/>
+              </w:rPr>
+              <w:t>Design</w:t>
+            </w:r>
+            <w:r>
+              <w:rPr>
+                <w:noProof/>
                 <w:webHidden/>
               </w:rPr>
               <w:tab/>
             </w:r>
             <w:r>
               <w:rPr>
-                <w:rFonts w:ascii="Times New Roman" w:hAnsi="Times New Roman"/>
                 <w:noProof/>
                 <w:webHidden/>
               </w:rPr>
@@ -981,22 +1053,19 @@
             </w:r>
             <w:r>
               <w:rPr>
-                <w:rFonts w:ascii="Times New Roman" w:hAnsi="Times New Roman"/>
                 <w:noProof/>
                 <w:webHidden/>
               </w:rPr>
-              <w:instrText xml:space="preserve"> PAGEREF _Toc225434896 \h </w:instrText>
-            </w:r>
-            <w:r>
-              <w:rPr>
-                <w:rFonts w:ascii="Times New Roman" w:hAnsi="Times New Roman"/>
+              <w:instrText xml:space="preserve"> PAGEREF _Toc225443460 \h </w:instrText>
+            </w:r>
+            <w:r>
+              <w:rPr>
                 <w:noProof/>
                 <w:webHidden/>
               </w:rPr>
             </w:r>
             <w:r>
               <w:rPr>
-                <w:rFonts w:ascii="Times New Roman" w:hAnsi="Times New Roman"/>
                 <w:noProof/>
                 <w:webHidden/>
               </w:rPr>
@@ -1004,15 +1073,13 @@
             </w:r>
             <w:r>
               <w:rPr>
-                <w:rFonts w:ascii="Times New Roman" w:hAnsi="Times New Roman"/>
                 <w:noProof/>
                 <w:webHidden/>
               </w:rPr>
-              <w:t>3</w:t>
-            </w:r>
-            <w:r>
-              <w:rPr>
-                <w:rFonts w:ascii="Times New Roman" w:hAnsi="Times New Roman"/>
+              <w:t>4</w:t>
+            </w:r>
+            <w:r>
+              <w:rPr>
                 <w:noProof/>
                 <w:webHidden/>
               </w:rPr>
@@ -1027,7 +1094,7 @@
               <w:tab w:val="right" w:leader="dot" w:pos="9016"/>
             </w:tabs>
             <w:rPr>
-              <w:rFonts w:ascii="Times New Roman" w:hAnsi="Times New Roman"/>
+              <w:rFonts w:cstheme="minorBidi"/>
               <w:noProof/>
               <w:kern w:val="2"/>
               <w:sz w:val="24"/>
@@ -1035,7 +1102,7 @@
               <w14:ligatures w14:val="standardContextual"/>
             </w:rPr>
           </w:pPr>
-          <w:hyperlink w:anchor="_Toc225434897" w:history="1">
+          <w:hyperlink w:anchor="_Toc225443461" w:history="1">
             <w:r>
               <w:rPr>
                 <w:rStyle w:val="Hyperlink"/>
@@ -1047,7 +1114,6 @@
             </w:r>
             <w:r>
               <w:rPr>
-                <w:rFonts w:ascii="Times New Roman" w:hAnsi="Times New Roman"/>
                 <w:noProof/>
                 <w:webHidden/>
               </w:rPr>
@@ -1055,7 +1121,6 @@
             </w:r>
             <w:r>
               <w:rPr>
-                <w:rFonts w:ascii="Times New Roman" w:hAnsi="Times New Roman"/>
                 <w:noProof/>
                 <w:webHidden/>
               </w:rPr>
@@ -1063,22 +1128,19 @@
             </w:r>
             <w:r>
               <w:rPr>
-                <w:rFonts w:ascii="Times New Roman" w:hAnsi="Times New Roman"/>
                 <w:noProof/>
                 <w:webHidden/>
               </w:rPr>
-              <w:instrText xml:space="preserve"> PAGEREF _Toc225434897 \h </w:instrText>
-            </w:r>
-            <w:r>
-              <w:rPr>
-                <w:rFonts w:ascii="Times New Roman" w:hAnsi="Times New Roman"/>
+              <w:instrText xml:space="preserve"> PAGEREF _Toc225443461 \h </w:instrText>
+            </w:r>
+            <w:r>
+              <w:rPr>
                 <w:noProof/>
                 <w:webHidden/>
               </w:rPr>
             </w:r>
             <w:r>
               <w:rPr>
-                <w:rFonts w:ascii="Times New Roman" w:hAnsi="Times New Roman"/>
                 <w:noProof/>
                 <w:webHidden/>
               </w:rPr>
@@ -1086,15 +1148,13 @@
             </w:r>
             <w:r>
               <w:rPr>
-                <w:rFonts w:ascii="Times New Roman" w:hAnsi="Times New Roman"/>
                 <w:noProof/>
                 <w:webHidden/>
               </w:rPr>
-              <w:t>3</w:t>
-            </w:r>
-            <w:r>
-              <w:rPr>
-                <w:rFonts w:ascii="Times New Roman" w:hAnsi="Times New Roman"/>
+              <w:t>4</w:t>
+            </w:r>
+            <w:r>
+              <w:rPr>
                 <w:noProof/>
                 <w:webHidden/>
               </w:rPr>
@@ -1104,12 +1164,13 @@
         </w:p>
         <w:p>
           <w:pPr>
-            <w:pStyle w:val="TOC2"/>
+            <w:pStyle w:val="TOC1"/>
             <w:tabs>
+              <w:tab w:val="left" w:pos="440"/>
               <w:tab w:val="right" w:leader="dot" w:pos="9016"/>
             </w:tabs>
             <w:rPr>
-              <w:rFonts w:ascii="Times New Roman" w:hAnsi="Times New Roman"/>
+              <w:rFonts w:cstheme="minorBidi"/>
               <w:noProof/>
               <w:kern w:val="2"/>
               <w:sz w:val="24"/>
@@ -1117,7 +1178,7 @@
               <w14:ligatures w14:val="standardContextual"/>
             </w:rPr>
           </w:pPr>
-          <w:hyperlink w:anchor="_Toc225434898" w:history="1">
+          <w:hyperlink w:anchor="_Toc225443462" w:history="1">
             <w:r>
               <w:rPr>
                 <w:rStyle w:val="Hyperlink"/>
@@ -1125,19 +1186,37 @@
                 <w:noProof/>
                 <w:lang w:val="en-US"/>
               </w:rPr>
-              <w:t>5.2 Design Patterns</w:t>
-            </w:r>
-            <w:r>
-              <w:rPr>
+              <w:t>6.</w:t>
+            </w:r>
+            <w:r>
+              <w:rPr>
+                <w:rFonts w:cstheme="minorBidi"/>
+                <w:noProof/>
+                <w:kern w:val="2"/>
+                <w:sz w:val="24"/>
+                <w:szCs w:val="24"/>
+                <w14:ligatures w14:val="standardContextual"/>
+              </w:rPr>
+              <w:tab/>
+            </w:r>
+            <w:r>
+              <w:rPr>
+                <w:rStyle w:val="Hyperlink"/>
                 <w:rFonts w:ascii="Times New Roman" w:hAnsi="Times New Roman"/>
                 <w:noProof/>
+                <w:lang w:val="en-US"/>
+              </w:rPr>
+              <w:t>Testing</w:t>
+            </w:r>
+            <w:r>
+              <w:rPr>
+                <w:noProof/>
                 <w:webHidden/>
               </w:rPr>
               <w:tab/>
             </w:r>
             <w:r>
               <w:rPr>
-                <w:rFonts w:ascii="Times New Roman" w:hAnsi="Times New Roman"/>
                 <w:noProof/>
                 <w:webHidden/>
               </w:rPr>
@@ -1145,22 +1224,19 @@
             </w:r>
             <w:r>
               <w:rPr>
-                <w:rFonts w:ascii="Times New Roman" w:hAnsi="Times New Roman"/>
                 <w:noProof/>
                 <w:webHidden/>
               </w:rPr>
-              <w:instrText xml:space="preserve"> PAGEREF _Toc225434898 \h </w:instrText>
-            </w:r>
-            <w:r>
-              <w:rPr>
-                <w:rFonts w:ascii="Times New Roman" w:hAnsi="Times New Roman"/>
+              <w:instrText xml:space="preserve"> PAGEREF _Toc225443462 \h </w:instrText>
+            </w:r>
+            <w:r>
+              <w:rPr>
                 <w:noProof/>
                 <w:webHidden/>
               </w:rPr>
             </w:r>
             <w:r>
               <w:rPr>
-                <w:rFonts w:ascii="Times New Roman" w:hAnsi="Times New Roman"/>
                 <w:noProof/>
                 <w:webHidden/>
               </w:rPr>
@@ -1168,15 +1244,13 @@
             </w:r>
             <w:r>
               <w:rPr>
-                <w:rFonts w:ascii="Times New Roman" w:hAnsi="Times New Roman"/>
                 <w:noProof/>
                 <w:webHidden/>
               </w:rPr>
-              <w:t>3</w:t>
-            </w:r>
-            <w:r>
-              <w:rPr>
-                <w:rFonts w:ascii="Times New Roman" w:hAnsi="Times New Roman"/>
+              <w:t>4</w:t>
+            </w:r>
+            <w:r>
+              <w:rPr>
                 <w:noProof/>
                 <w:webHidden/>
               </w:rPr>
@@ -1188,10 +1262,11 @@
           <w:pPr>
             <w:pStyle w:val="TOC1"/>
             <w:tabs>
+              <w:tab w:val="left" w:pos="440"/>
               <w:tab w:val="right" w:leader="dot" w:pos="9016"/>
             </w:tabs>
             <w:rPr>
-              <w:rFonts w:ascii="Times New Roman" w:hAnsi="Times New Roman"/>
+              <w:rFonts w:cstheme="minorBidi"/>
               <w:noProof/>
               <w:kern w:val="2"/>
               <w:sz w:val="24"/>
@@ -1199,7 +1274,7 @@
               <w14:ligatures w14:val="standardContextual"/>
             </w:rPr>
           </w:pPr>
-          <w:hyperlink w:anchor="_Toc225434899" w:history="1">
+          <w:hyperlink w:anchor="_Toc225443463" w:history="1">
             <w:r>
               <w:rPr>
                 <w:rStyle w:val="Hyperlink"/>
@@ -1207,19 +1282,37 @@
                 <w:noProof/>
                 <w:lang w:val="en-US"/>
               </w:rPr>
-              <w:t>6. Testing</w:t>
-            </w:r>
-            <w:r>
-              <w:rPr>
+              <w:t>7.</w:t>
+            </w:r>
+            <w:r>
+              <w:rPr>
+                <w:rFonts w:cstheme="minorBidi"/>
+                <w:noProof/>
+                <w:kern w:val="2"/>
+                <w:sz w:val="24"/>
+                <w:szCs w:val="24"/>
+                <w14:ligatures w14:val="standardContextual"/>
+              </w:rPr>
+              <w:tab/>
+            </w:r>
+            <w:r>
+              <w:rPr>
+                <w:rStyle w:val="Hyperlink"/>
                 <w:rFonts w:ascii="Times New Roman" w:hAnsi="Times New Roman"/>
                 <w:noProof/>
+                <w:lang w:val="en-US"/>
+              </w:rPr>
+              <w:t>Security</w:t>
+            </w:r>
+            <w:r>
+              <w:rPr>
+                <w:noProof/>
                 <w:webHidden/>
               </w:rPr>
               <w:tab/>
             </w:r>
             <w:r>
               <w:rPr>
-                <w:rFonts w:ascii="Times New Roman" w:hAnsi="Times New Roman"/>
                 <w:noProof/>
                 <w:webHidden/>
               </w:rPr>
@@ -1227,22 +1320,19 @@
             </w:r>
             <w:r>
               <w:rPr>
-                <w:rFonts w:ascii="Times New Roman" w:hAnsi="Times New Roman"/>
                 <w:noProof/>
                 <w:webHidden/>
               </w:rPr>
-              <w:instrText xml:space="preserve"> PAGEREF _Toc225434899 \h </w:instrText>
-            </w:r>
-            <w:r>
-              <w:rPr>
-                <w:rFonts w:ascii="Times New Roman" w:hAnsi="Times New Roman"/>
+              <w:instrText xml:space="preserve"> PAGEREF _Toc225443463 \h </w:instrText>
+            </w:r>
+            <w:r>
+              <w:rPr>
                 <w:noProof/>
                 <w:webHidden/>
               </w:rPr>
             </w:r>
             <w:r>
               <w:rPr>
-                <w:rFonts w:ascii="Times New Roman" w:hAnsi="Times New Roman"/>
                 <w:noProof/>
                 <w:webHidden/>
               </w:rPr>
@@ -1250,15 +1340,13 @@
             </w:r>
             <w:r>
               <w:rPr>
-                <w:rFonts w:ascii="Times New Roman" w:hAnsi="Times New Roman"/>
                 <w:noProof/>
                 <w:webHidden/>
               </w:rPr>
-              <w:t>3</w:t>
-            </w:r>
-            <w:r>
-              <w:rPr>
-                <w:rFonts w:ascii="Times New Roman" w:hAnsi="Times New Roman"/>
+              <w:t>5</w:t>
+            </w:r>
+            <w:r>
+              <w:rPr>
                 <w:noProof/>
                 <w:webHidden/>
               </w:rPr>
@@ -1270,10 +1358,11 @@
           <w:pPr>
             <w:pStyle w:val="TOC1"/>
             <w:tabs>
+              <w:tab w:val="left" w:pos="440"/>
               <w:tab w:val="right" w:leader="dot" w:pos="9016"/>
             </w:tabs>
             <w:rPr>
-              <w:rFonts w:ascii="Times New Roman" w:hAnsi="Times New Roman"/>
+              <w:rFonts w:cstheme="minorBidi"/>
               <w:noProof/>
               <w:kern w:val="2"/>
               <w:sz w:val="24"/>
@@ -1281,7 +1370,7 @@
               <w14:ligatures w14:val="standardContextual"/>
             </w:rPr>
           </w:pPr>
-          <w:hyperlink w:anchor="_Toc225434900" w:history="1">
+          <w:hyperlink w:anchor="_Toc225443464" w:history="1">
             <w:r>
               <w:rPr>
                 <w:rStyle w:val="Hyperlink"/>
@@ -1289,19 +1378,37 @@
                 <w:noProof/>
                 <w:lang w:val="en-US"/>
               </w:rPr>
-              <w:t>7. Security</w:t>
-            </w:r>
-            <w:r>
-              <w:rPr>
+              <w:t>8.</w:t>
+            </w:r>
+            <w:r>
+              <w:rPr>
+                <w:rFonts w:cstheme="minorBidi"/>
+                <w:noProof/>
+                <w:kern w:val="2"/>
+                <w:sz w:val="24"/>
+                <w:szCs w:val="24"/>
+                <w14:ligatures w14:val="standardContextual"/>
+              </w:rPr>
+              <w:tab/>
+            </w:r>
+            <w:r>
+              <w:rPr>
+                <w:rStyle w:val="Hyperlink"/>
                 <w:rFonts w:ascii="Times New Roman" w:hAnsi="Times New Roman"/>
                 <w:noProof/>
+                <w:lang w:val="en-US"/>
+              </w:rPr>
+              <w:t>DevOps</w:t>
+            </w:r>
+            <w:r>
+              <w:rPr>
+                <w:noProof/>
                 <w:webHidden/>
               </w:rPr>
               <w:tab/>
             </w:r>
             <w:r>
               <w:rPr>
-                <w:rFonts w:ascii="Times New Roman" w:hAnsi="Times New Roman"/>
                 <w:noProof/>
                 <w:webHidden/>
               </w:rPr>
@@ -1309,22 +1416,19 @@
             </w:r>
             <w:r>
               <w:rPr>
-                <w:rFonts w:ascii="Times New Roman" w:hAnsi="Times New Roman"/>
                 <w:noProof/>
                 <w:webHidden/>
               </w:rPr>
-              <w:instrText xml:space="preserve"> PAGEREF _Toc225434900 \h </w:instrText>
-            </w:r>
-            <w:r>
-              <w:rPr>
-                <w:rFonts w:ascii="Times New Roman" w:hAnsi="Times New Roman"/>
+              <w:instrText xml:space="preserve"> PAGEREF _Toc225443464 \h </w:instrText>
+            </w:r>
+            <w:r>
+              <w:rPr>
                 <w:noProof/>
                 <w:webHidden/>
               </w:rPr>
             </w:r>
             <w:r>
               <w:rPr>
-                <w:rFonts w:ascii="Times New Roman" w:hAnsi="Times New Roman"/>
                 <w:noProof/>
                 <w:webHidden/>
               </w:rPr>
@@ -1332,15 +1436,13 @@
             </w:r>
             <w:r>
               <w:rPr>
-                <w:rFonts w:ascii="Times New Roman" w:hAnsi="Times New Roman"/>
                 <w:noProof/>
                 <w:webHidden/>
               </w:rPr>
-              <w:t>3</w:t>
-            </w:r>
-            <w:r>
-              <w:rPr>
-                <w:rFonts w:ascii="Times New Roman" w:hAnsi="Times New Roman"/>
+              <w:t>5</w:t>
+            </w:r>
+            <w:r>
+              <w:rPr>
                 <w:noProof/>
                 <w:webHidden/>
               </w:rPr>
@@ -1352,10 +1454,11 @@
           <w:pPr>
             <w:pStyle w:val="TOC1"/>
             <w:tabs>
+              <w:tab w:val="left" w:pos="440"/>
               <w:tab w:val="right" w:leader="dot" w:pos="9016"/>
             </w:tabs>
             <w:rPr>
-              <w:rFonts w:ascii="Times New Roman" w:hAnsi="Times New Roman"/>
+              <w:rFonts w:cstheme="minorBidi"/>
               <w:noProof/>
               <w:kern w:val="2"/>
               <w:sz w:val="24"/>
@@ -1363,7 +1466,7 @@
               <w14:ligatures w14:val="standardContextual"/>
             </w:rPr>
           </w:pPr>
-          <w:hyperlink w:anchor="_Toc225434901" w:history="1">
+          <w:hyperlink w:anchor="_Toc225443465" w:history="1">
             <w:r>
               <w:rPr>
                 <w:rStyle w:val="Hyperlink"/>
@@ -1371,81 +1474,19 @@
                 <w:noProof/>
                 <w:lang w:val="en-US"/>
               </w:rPr>
-              <w:t>8. DevOps</w:t>
-            </w:r>
-            <w:r>
-              <w:rPr>
-                <w:rFonts w:ascii="Times New Roman" w:hAnsi="Times New Roman"/>
-                <w:noProof/>
-                <w:webHidden/>
+              <w:t>9.</w:t>
+            </w:r>
+            <w:r>
+              <w:rPr>
+                <w:rFonts w:cstheme="minorBidi"/>
+                <w:noProof/>
+                <w:kern w:val="2"/>
+                <w:sz w:val="24"/>
+                <w:szCs w:val="24"/>
+                <w14:ligatures w14:val="standardContextual"/>
               </w:rPr>
               <w:tab/>
             </w:r>
-            <w:r>
-              <w:rPr>
-                <w:rFonts w:ascii="Times New Roman" w:hAnsi="Times New Roman"/>
-                <w:noProof/>
-                <w:webHidden/>
-              </w:rPr>
-              <w:fldChar w:fldCharType="begin"/>
-            </w:r>
-            <w:r>
-              <w:rPr>
-                <w:rFonts w:ascii="Times New Roman" w:hAnsi="Times New Roman"/>
-                <w:noProof/>
-                <w:webHidden/>
-              </w:rPr>
-              <w:instrText xml:space="preserve"> PAGEREF _Toc225434901 \h </w:instrText>
-            </w:r>
-            <w:r>
-              <w:rPr>
-                <w:rFonts w:ascii="Times New Roman" w:hAnsi="Times New Roman"/>
-                <w:noProof/>
-                <w:webHidden/>
-              </w:rPr>
-            </w:r>
-            <w:r>
-              <w:rPr>
-                <w:rFonts w:ascii="Times New Roman" w:hAnsi="Times New Roman"/>
-                <w:noProof/>
-                <w:webHidden/>
-              </w:rPr>
-              <w:fldChar w:fldCharType="separate"/>
-            </w:r>
-            <w:r>
-              <w:rPr>
-                <w:rFonts w:ascii="Times New Roman" w:hAnsi="Times New Roman"/>
-                <w:noProof/>
-                <w:webHidden/>
-              </w:rPr>
-              <w:t>3</w:t>
-            </w:r>
-            <w:r>
-              <w:rPr>
-                <w:rFonts w:ascii="Times New Roman" w:hAnsi="Times New Roman"/>
-                <w:noProof/>
-                <w:webHidden/>
-              </w:rPr>
-              <w:fldChar w:fldCharType="end"/>
-            </w:r>
-          </w:hyperlink>
-        </w:p>
-        <w:p>
-          <w:pPr>
-            <w:pStyle w:val="TOC1"/>
-            <w:tabs>
-              <w:tab w:val="right" w:leader="dot" w:pos="9016"/>
-            </w:tabs>
-            <w:rPr>
-              <w:rFonts w:ascii="Times New Roman" w:hAnsi="Times New Roman"/>
-              <w:noProof/>
-              <w:kern w:val="2"/>
-              <w:sz w:val="24"/>
-              <w:szCs w:val="24"/>
-              <w14:ligatures w14:val="standardContextual"/>
-            </w:rPr>
-          </w:pPr>
-          <w:hyperlink w:anchor="_Toc225434902" w:history="1">
             <w:r>
               <w:rPr>
                 <w:rStyle w:val="Hyperlink"/>
@@ -1453,11 +1494,10 @@
                 <w:noProof/>
                 <w:lang w:val="en-US"/>
               </w:rPr>
-              <w:t>9. References</w:t>
-            </w:r>
-            <w:r>
-              <w:rPr>
-                <w:rFonts w:ascii="Times New Roman" w:hAnsi="Times New Roman"/>
+              <w:t>References</w:t>
+            </w:r>
+            <w:r>
+              <w:rPr>
                 <w:noProof/>
                 <w:webHidden/>
               </w:rPr>
@@ -1465,7 +1505,6 @@
             </w:r>
             <w:r>
               <w:rPr>
-                <w:rFonts w:ascii="Times New Roman" w:hAnsi="Times New Roman"/>
                 <w:noProof/>
                 <w:webHidden/>
               </w:rPr>
@@ -1473,22 +1512,19 @@
             </w:r>
             <w:r>
               <w:rPr>
-                <w:rFonts w:ascii="Times New Roman" w:hAnsi="Times New Roman"/>
                 <w:noProof/>
                 <w:webHidden/>
               </w:rPr>
-              <w:instrText xml:space="preserve"> PAGEREF _Toc225434902 \h </w:instrText>
-            </w:r>
-            <w:r>
-              <w:rPr>
-                <w:rFonts w:ascii="Times New Roman" w:hAnsi="Times New Roman"/>
+              <w:instrText xml:space="preserve"> PAGEREF _Toc225443465 \h </w:instrText>
+            </w:r>
+            <w:r>
+              <w:rPr>
                 <w:noProof/>
                 <w:webHidden/>
               </w:rPr>
             </w:r>
             <w:r>
               <w:rPr>
-                <w:rFonts w:ascii="Times New Roman" w:hAnsi="Times New Roman"/>
                 <w:noProof/>
                 <w:webHidden/>
               </w:rPr>
@@ -1496,15 +1532,13 @@
             </w:r>
             <w:r>
               <w:rPr>
-                <w:rFonts w:ascii="Times New Roman" w:hAnsi="Times New Roman"/>
                 <w:noProof/>
                 <w:webHidden/>
               </w:rPr>
-              <w:t>3</w:t>
-            </w:r>
-            <w:r>
-              <w:rPr>
-                <w:rFonts w:ascii="Times New Roman" w:hAnsi="Times New Roman"/>
+              <w:t>6</w:t>
+            </w:r>
+            <w:r>
+              <w:rPr>
                 <w:noProof/>
                 <w:webHidden/>
               </w:rPr>
@@ -1673,7 +1707,7 @@
           <w:rFonts w:ascii="Times New Roman" w:hAnsi="Times New Roman" w:cs="Times New Roman"/>
         </w:rPr>
       </w:pPr>
-      <w:bookmarkStart w:id="0" w:name="_Toc225434890"/>
+      <w:bookmarkStart w:id="0" w:name="_Toc225443454"/>
       <w:r>
         <w:rPr>
           <w:rFonts w:ascii="Times New Roman" w:hAnsi="Times New Roman" w:cs="Times New Roman"/>
@@ -1772,7 +1806,7 @@
           <w:lang w:val="en-US"/>
         </w:rPr>
       </w:pPr>
-      <w:bookmarkStart w:id="1" w:name="_Toc225434891"/>
+      <w:bookmarkStart w:id="1" w:name="_Toc225443455"/>
       <w:r>
         <w:rPr>
           <w:rFonts w:ascii="Times New Roman" w:hAnsi="Times New Roman" w:cs="Times New Roman"/>
@@ -1988,7 +2022,7 @@
           <w:lang w:val="en-US"/>
         </w:rPr>
       </w:pPr>
-      <w:bookmarkStart w:id="2" w:name="_Toc225434892"/>
+      <w:bookmarkStart w:id="2" w:name="_Toc225443456"/>
       <w:r>
         <w:rPr>
           <w:rFonts w:ascii="Times New Roman" w:hAnsi="Times New Roman" w:cs="Times New Roman"/>
@@ -2067,7 +2101,7 @@
           <w:lang w:val="en-US"/>
         </w:rPr>
       </w:pPr>
-      <w:bookmarkStart w:id="3" w:name="_Toc225434893"/>
+      <w:bookmarkStart w:id="3" w:name="_Toc225443457"/>
       <w:r>
         <w:rPr>
           <w:rFonts w:ascii="Times New Roman" w:hAnsi="Times New Roman" w:cs="Times New Roman"/>
@@ -2111,7 +2145,7 @@
           <w:lang w:val="en-US"/>
         </w:rPr>
       </w:pPr>
-      <w:bookmarkStart w:id="4" w:name="_Toc225434894"/>
+      <w:bookmarkStart w:id="4" w:name="_Toc225443458"/>
       <w:r>
         <w:rPr>
           <w:rFonts w:ascii="Times New Roman" w:hAnsi="Times New Roman" w:cs="Times New Roman"/>
@@ -2123,13 +2157,39 @@
     </w:p>
     <w:p>
       <w:pPr>
+        <w:rPr>
+          <w:lang w:val="en-US"/>
+        </w:rPr>
+      </w:pPr>
+      <w:r>
+        <w:rPr>
+          <w:lang w:val="en-US"/>
+        </w:rPr>
+        <w:t>To figure out what to build, I researched similar sites online and worked through them as any normal user. I created a user story, use cases and use case descriptions, which can be viewed in the requirements.docx., to help plan how to structure the web-application.</w:t>
+      </w:r>
+    </w:p>
+    <w:p>
+      <w:pPr>
+        <w:rPr>
+          <w:lang w:val="en-US"/>
+        </w:rPr>
+      </w:pPr>
+      <w:r>
+        <w:rPr>
+          <w:lang w:val="en-US"/>
+        </w:rPr>
+        <w:t xml:space="preserve">During the creation of the system, some requirements did change including allowing admins to view all user data. </w:t>
+      </w:r>
+    </w:p>
+    <w:p>
+      <w:pPr>
         <w:pStyle w:val="Heading2"/>
         <w:rPr>
           <w:rFonts w:ascii="Times New Roman" w:hAnsi="Times New Roman" w:cs="Times New Roman"/>
           <w:lang w:val="en-US"/>
         </w:rPr>
       </w:pPr>
-      <w:bookmarkStart w:id="5" w:name="_Toc225434895"/>
+      <w:bookmarkStart w:id="5" w:name="_Toc225443459"/>
       <w:r>
         <w:rPr>
           <w:rFonts w:ascii="Times New Roman" w:hAnsi="Times New Roman" w:cs="Times New Roman"/>
@@ -2141,13 +2201,153 @@
     </w:p>
     <w:p>
       <w:pPr>
+        <w:rPr>
+          <w:lang w:val="en-US"/>
+        </w:rPr>
+      </w:pPr>
+      <w:r>
+        <w:rPr>
+          <w:lang w:val="en-US"/>
+        </w:rPr>
+        <w:t xml:space="preserve">Functional requirements specify </w:t>
+      </w:r>
+      <w:r>
+        <w:rPr>
+          <w:lang w:val="en-US"/>
+        </w:rPr>
+        <w:t>the behaviour</w:t>
+      </w:r>
+      <w:r>
+        <w:rPr>
+          <w:lang w:val="en-US"/>
+        </w:rPr>
+        <w:t xml:space="preserve"> the system must perform and are given in order of importance to the functionality of the application.</w:t>
+      </w:r>
+      <w:r>
+        <w:rPr>
+          <w:lang w:val="en-US"/>
+        </w:rPr>
+        <w:t xml:space="preserve"> Non-functional requirements are quality attributes rather than a specific functional behaviour of the application.</w:t>
+      </w:r>
+      <w:r>
+        <w:rPr>
+          <w:lang w:val="en-US"/>
+        </w:rPr>
+        <w:t xml:space="preserve">  </w:t>
+      </w:r>
+    </w:p>
+    <w:p>
+      <w:pPr>
+        <w:rPr>
+          <w:lang w:val="en-US"/>
+        </w:rPr>
+      </w:pPr>
+      <w:r>
+        <w:rPr>
+          <w:lang w:val="en-US"/>
+        </w:rPr>
+        <w:t xml:space="preserve">The requirements document uses the </w:t>
+      </w:r>
+      <w:proofErr w:type="spellStart"/>
+      <w:r>
+        <w:rPr>
+          <w:lang w:val="en-US"/>
+        </w:rPr>
+        <w:t>MoSCoW</w:t>
+      </w:r>
+      <w:proofErr w:type="spellEnd"/>
+      <w:r>
+        <w:rPr>
+          <w:lang w:val="en-US"/>
+        </w:rPr>
+        <w:t xml:space="preserve"> system to </w:t>
+      </w:r>
+      <w:proofErr w:type="spellStart"/>
+      <w:r>
+        <w:rPr>
+          <w:lang w:val="en-US"/>
+        </w:rPr>
+        <w:t>prioritise</w:t>
+      </w:r>
+      <w:proofErr w:type="spellEnd"/>
+      <w:r>
+        <w:rPr>
+          <w:lang w:val="en-US"/>
+        </w:rPr>
+        <w:t xml:space="preserve"> the requirements </w:t>
+      </w:r>
+      <w:proofErr w:type="gramStart"/>
+      <w:r>
+        <w:rPr>
+          <w:lang w:val="en-US"/>
+        </w:rPr>
+        <w:t>where,</w:t>
+      </w:r>
+      <w:proofErr w:type="gramEnd"/>
+      <w:r>
+        <w:rPr>
+          <w:lang w:val="en-US"/>
+        </w:rPr>
+        <w:t xml:space="preserve"> M </w:t>
+      </w:r>
+      <w:proofErr w:type="gramStart"/>
+      <w:r>
+        <w:rPr>
+          <w:lang w:val="en-US"/>
+        </w:rPr>
+        <w:t>is Must Have</w:t>
+      </w:r>
+      <w:proofErr w:type="gramEnd"/>
+      <w:r>
+        <w:rPr>
+          <w:lang w:val="en-US"/>
+        </w:rPr>
+        <w:t xml:space="preserve">, S </w:t>
+      </w:r>
+      <w:proofErr w:type="gramStart"/>
+      <w:r>
+        <w:rPr>
+          <w:lang w:val="en-US"/>
+        </w:rPr>
+        <w:t>is Should Have</w:t>
+      </w:r>
+      <w:proofErr w:type="gramEnd"/>
+      <w:r>
+        <w:rPr>
+          <w:lang w:val="en-US"/>
+        </w:rPr>
+        <w:t xml:space="preserve">, C </w:t>
+      </w:r>
+      <w:proofErr w:type="gramStart"/>
+      <w:r>
+        <w:rPr>
+          <w:lang w:val="en-US"/>
+        </w:rPr>
+        <w:t>is Could Have</w:t>
+      </w:r>
+      <w:proofErr w:type="gramEnd"/>
+      <w:r>
+        <w:rPr>
+          <w:lang w:val="en-US"/>
+        </w:rPr>
+        <w:t xml:space="preserve"> and W is Want to Have.</w:t>
+      </w:r>
+      <w:r>
+        <w:rPr>
+          <w:lang w:val="en-US"/>
+        </w:rPr>
+        <w:t xml:space="preserve"> The grading system can be viewed in the requirements.docx.</w:t>
+      </w:r>
+    </w:p>
+    <w:p>
+      <w:pPr>
         <w:pStyle w:val="Heading1"/>
         <w:rPr>
           <w:rFonts w:ascii="Times New Roman" w:hAnsi="Times New Roman" w:cs="Times New Roman"/>
           <w:lang w:val="en-US"/>
         </w:rPr>
       </w:pPr>
-      <w:bookmarkStart w:id="6" w:name="_Toc225434896"/>
+      <w:bookmarkStart w:id="6" w:name="_Toc225443460"/>
       <w:r>
         <w:rPr>
           <w:rFonts w:ascii="Times New Roman" w:hAnsi="Times New Roman" w:cs="Times New Roman"/>
@@ -2165,7 +2365,7 @@
           <w:lang w:val="en-US"/>
         </w:rPr>
       </w:pPr>
-      <w:bookmarkStart w:id="7" w:name="_Toc225434897"/>
+      <w:bookmarkStart w:id="7" w:name="_Toc225443461"/>
       <w:r>
         <w:rPr>
           <w:rFonts w:ascii="Times New Roman" w:hAnsi="Times New Roman" w:cs="Times New Roman"/>
@@ -2177,145 +2377,896 @@
     </w:p>
     <w:p>
       <w:pPr>
-        <w:pStyle w:val="Heading2"/>
-        <w:rPr>
-          <w:rFonts w:ascii="Times New Roman" w:hAnsi="Times New Roman" w:cs="Times New Roman"/>
-          <w:lang w:val="en-US"/>
-        </w:rPr>
-      </w:pPr>
-      <w:bookmarkStart w:id="8" w:name="_Toc225434898"/>
-      <w:r>
-        <w:rPr>
-          <w:rFonts w:ascii="Times New Roman" w:hAnsi="Times New Roman" w:cs="Times New Roman"/>
-          <w:lang w:val="en-US"/>
-        </w:rPr>
-        <w:t>Design Patterns</w:t>
+        <w:rPr>
+          <w:lang w:val="en-US"/>
+        </w:rPr>
+      </w:pPr>
+      <w:r>
+        <w:rPr>
+          <w:lang w:val="en-US"/>
+        </w:rPr>
+        <w:t xml:space="preserve">Not much detail was implanted into the wireframes as they only needed to outline the important functionality requirements. All the outlined requirements were implemented into the final </w:t>
+      </w:r>
+      <w:r>
+        <w:rPr>
+          <w:lang w:val="en-US"/>
+        </w:rPr>
+        <w:t>product,</w:t>
+      </w:r>
+      <w:r>
+        <w:rPr>
+          <w:lang w:val="en-US"/>
+        </w:rPr>
+        <w:t xml:space="preserve"> and each page was designed to a similar format.</w:t>
+      </w:r>
+    </w:p>
+    <w:p>
+      <w:pPr>
+        <w:rPr>
+          <w:lang w:val="en-US"/>
+        </w:rPr>
+      </w:pPr>
+      <w:r>
+        <w:rPr>
+          <w:lang w:val="en-US"/>
+        </w:rPr>
+        <w:t xml:space="preserve">The only design changes that came nearer the end of the </w:t>
+      </w:r>
+      <w:r>
+        <w:rPr>
+          <w:lang w:val="en-US"/>
+        </w:rPr>
+        <w:t>timeline</w:t>
+      </w:r>
+      <w:r>
+        <w:rPr>
+          <w:lang w:val="en-US"/>
+        </w:rPr>
+        <w:t xml:space="preserve"> were changes to the dashboard and how the users and admins viewed the booking details. </w:t>
+      </w:r>
+      <w:r>
+        <w:rPr>
+          <w:lang w:val="en-US"/>
+        </w:rPr>
+        <w:t>This became important to show old bookings compared to current “scheduled” bookings.</w:t>
+      </w:r>
+    </w:p>
+    <w:p>
+      <w:pPr>
+        <w:rPr>
+          <w:lang w:val="en-US"/>
+        </w:rPr>
+      </w:pPr>
+      <w:r>
+        <w:rPr>
+          <w:lang w:val="en-US"/>
+        </w:rPr>
+        <w:t xml:space="preserve">More details about the </w:t>
+      </w:r>
+      <w:r>
+        <w:rPr>
+          <w:lang w:val="en-US"/>
+        </w:rPr>
+        <w:t>design</w:t>
+      </w:r>
+      <w:r>
+        <w:rPr>
+          <w:lang w:val="en-US"/>
+        </w:rPr>
+        <w:t xml:space="preserve"> of the application can be found </w:t>
+      </w:r>
+      <w:proofErr w:type="gramStart"/>
+      <w:r>
+        <w:rPr>
+          <w:lang w:val="en-US"/>
+        </w:rPr>
+        <w:t>in</w:t>
+      </w:r>
+      <w:proofErr w:type="gramEnd"/>
+      <w:r>
+        <w:rPr>
+          <w:lang w:val="en-US"/>
+        </w:rPr>
+        <w:t xml:space="preserve"> </w:t>
+      </w:r>
+      <w:r>
+        <w:rPr>
+          <w:lang w:val="en-US"/>
+        </w:rPr>
+        <w:t>Design.docx</w:t>
+      </w:r>
+      <w:r>
+        <w:rPr>
+          <w:lang w:val="en-US"/>
+        </w:rPr>
+        <w:t>.</w:t>
+      </w:r>
+    </w:p>
+    <w:p>
+      <w:pPr>
+        <w:pStyle w:val="Heading1"/>
+        <w:rPr>
+          <w:rFonts w:ascii="Times New Roman" w:hAnsi="Times New Roman" w:cs="Times New Roman"/>
+          <w:lang w:val="en-US"/>
+        </w:rPr>
+      </w:pPr>
+      <w:bookmarkStart w:id="8" w:name="_Toc225443462"/>
+      <w:r>
+        <w:rPr>
+          <w:rFonts w:ascii="Times New Roman" w:hAnsi="Times New Roman" w:cs="Times New Roman"/>
+          <w:lang w:val="en-US"/>
+        </w:rPr>
+        <w:t>Testing</w:t>
       </w:r>
       <w:bookmarkEnd w:id="8"/>
     </w:p>
     <w:p>
       <w:pPr>
+        <w:rPr>
+          <w:lang w:val="en-US"/>
+        </w:rPr>
+      </w:pPr>
+      <w:r>
+        <w:rPr>
+          <w:lang w:val="en-US"/>
+        </w:rPr>
+        <w:t xml:space="preserve">Not a lot of testing was executed in this project. However, the main two tests conducted </w:t>
+      </w:r>
+      <w:r>
+        <w:rPr>
+          <w:lang w:val="en-US"/>
+        </w:rPr>
+        <w:t xml:space="preserve">were automated. Using Djangos </w:t>
+      </w:r>
+      <w:proofErr w:type="spellStart"/>
+      <w:r>
+        <w:rPr>
+          <w:lang w:val="en-US"/>
+        </w:rPr>
+        <w:t>TestCase</w:t>
+      </w:r>
+      <w:proofErr w:type="spellEnd"/>
+      <w:r>
+        <w:rPr>
+          <w:lang w:val="en-US"/>
+        </w:rPr>
+        <w:t xml:space="preserve"> to run each test inside a transaction to provide isolation </w:t>
+      </w:r>
+      <w:r>
+        <w:rPr>
+          <w:i/>
+          <w:iCs/>
+          <w:lang w:val="en-US"/>
+        </w:rPr>
+        <w:t>(Django Documentation, 2026</w:t>
+      </w:r>
+      <w:proofErr w:type="gramStart"/>
+      <w:r>
+        <w:rPr>
+          <w:i/>
+          <w:iCs/>
+          <w:lang w:val="en-US"/>
+        </w:rPr>
+        <w:t>)</w:t>
+      </w:r>
+      <w:r>
+        <w:rPr>
+          <w:i/>
+          <w:iCs/>
+          <w:lang w:val="en-US"/>
+        </w:rPr>
+        <w:t xml:space="preserve"> </w:t>
+      </w:r>
+      <w:r>
+        <w:rPr>
+          <w:lang w:val="en-US"/>
+        </w:rPr>
+        <w:t>,</w:t>
+      </w:r>
+      <w:proofErr w:type="gramEnd"/>
+      <w:r>
+        <w:rPr>
+          <w:lang w:val="en-US"/>
+        </w:rPr>
+        <w:t xml:space="preserve"> </w:t>
+      </w:r>
+      <w:r>
+        <w:rPr>
+          <w:lang w:val="en-US"/>
+        </w:rPr>
+        <w:t xml:space="preserve">they </w:t>
+      </w:r>
+      <w:r>
+        <w:rPr>
+          <w:lang w:val="en-US"/>
+        </w:rPr>
+        <w:t>verified a text autocomplete would work correctly, and checks if the flight search form is rendered as HTML and confirms the dropdown of suggestions works correctly.</w:t>
+      </w:r>
+      <w:r>
+        <w:rPr>
+          <w:lang w:val="en-US"/>
+        </w:rPr>
+        <w:t xml:space="preserve"> More information about these tests can be found in the Testing.docx.</w:t>
+      </w:r>
+    </w:p>
+    <w:p>
+      <w:pPr>
+        <w:rPr>
+          <w:lang w:val="en-US"/>
+        </w:rPr>
+      </w:pPr>
+      <w:r>
+        <w:rPr>
+          <w:lang w:val="en-US"/>
+        </w:rPr>
+        <w:lastRenderedPageBreak/>
+        <w:t>Another test not detailed in the Testing.docx is the web lighthouse test.</w:t>
+      </w:r>
+      <w:r>
+        <w:rPr>
+          <w:lang w:val="en-US"/>
+        </w:rPr>
+        <w:t xml:space="preserve"> Below two screenshots of the lighthouse tests can be seen. One for desktops and the other for </w:t>
+      </w:r>
+      <w:proofErr w:type="gramStart"/>
+      <w:r>
+        <w:rPr>
+          <w:lang w:val="en-US"/>
+        </w:rPr>
+        <w:t>mobile</w:t>
+      </w:r>
+      <w:proofErr w:type="gramEnd"/>
+      <w:r>
+        <w:rPr>
+          <w:lang w:val="en-US"/>
+        </w:rPr>
+        <w:t xml:space="preserve">. All shows great scores for all categories. </w:t>
+      </w:r>
+    </w:p>
+    <w:p>
+      <w:pPr>
+        <w:keepNext/>
+        <w:jc w:val="center"/>
+      </w:pPr>
+      <w:r>
+        <w:rPr>
+          <w:lang w:val="en-US"/>
+        </w:rPr>
+        <w:drawing>
+          <wp:inline distT="0" distB="0" distL="0" distR="0" wp14:anchorId="70D0B91E" wp14:editId="6BC1CB27">
+            <wp:extent cx="2982013" cy="892098"/>
+            <wp:effectExtent l="0" t="0" r="0" b="3810"/>
+            <wp:docPr id="1977455185" name="Picture 1"/>
+            <wp:cNvGraphicFramePr>
+              <a:graphicFrameLocks xmlns:a="http://schemas.openxmlformats.org/drawingml/2006/main" noChangeAspect="1"/>
+            </wp:cNvGraphicFramePr>
+            <a:graphic xmlns:a="http://schemas.openxmlformats.org/drawingml/2006/main">
+              <a:graphicData uri="http://schemas.openxmlformats.org/drawingml/2006/picture">
+                <pic:pic xmlns:pic="http://schemas.openxmlformats.org/drawingml/2006/picture">
+                  <pic:nvPicPr>
+                    <pic:cNvPr id="1977455185" name=""/>
+                    <pic:cNvPicPr/>
+                  </pic:nvPicPr>
+                  <pic:blipFill>
+                    <a:blip r:embed="rId8"/>
+                    <a:stretch>
+                      <a:fillRect/>
+                    </a:stretch>
+                  </pic:blipFill>
+                  <pic:spPr>
+                    <a:xfrm>
+                      <a:off x="0" y="0"/>
+                      <a:ext cx="3002908" cy="898349"/>
+                    </a:xfrm>
+                    <a:prstGeom prst="rect">
+                      <a:avLst/>
+                    </a:prstGeom>
+                  </pic:spPr>
+                </pic:pic>
+              </a:graphicData>
+            </a:graphic>
+          </wp:inline>
+        </w:drawing>
+      </w:r>
+    </w:p>
+    <w:p>
+      <w:pPr>
+        <w:pStyle w:val="Caption"/>
+        <w:jc w:val="center"/>
+        <w:rPr>
+          <w:lang w:val="en-US"/>
+        </w:rPr>
+      </w:pPr>
+      <w:r>
+        <w:t xml:space="preserve">Figure </w:t>
+      </w:r>
+      <w:r>
+        <w:fldChar w:fldCharType="begin"/>
+      </w:r>
+      <w:r>
+        <w:instrText xml:space="preserve"> STYLEREF 1 \s </w:instrText>
+      </w:r>
+      <w:r>
+        <w:fldChar w:fldCharType="separate"/>
+      </w:r>
+      <w:r>
+        <w:rPr>
+          <w:noProof/>
+        </w:rPr>
+        <w:t>6</w:t>
+      </w:r>
+      <w:r>
+        <w:fldChar w:fldCharType="end"/>
+      </w:r>
+      <w:r>
+        <w:t>.</w:t>
+      </w:r>
+      <w:r>
+        <w:fldChar w:fldCharType="begin"/>
+      </w:r>
+      <w:r>
+        <w:instrText xml:space="preserve"> SEQ Figure \* ARABIC \s 1 </w:instrText>
+      </w:r>
+      <w:r>
+        <w:fldChar w:fldCharType="separate"/>
+      </w:r>
+      <w:r>
+        <w:rPr>
+          <w:noProof/>
+        </w:rPr>
+        <w:t>1</w:t>
+      </w:r>
+      <w:r>
+        <w:fldChar w:fldCharType="end"/>
+      </w:r>
+      <w:r>
+        <w:t xml:space="preserve"> - Desktop Lighthouse Test</w:t>
+      </w:r>
+    </w:p>
+    <w:p>
+      <w:pPr>
+        <w:keepNext/>
+        <w:jc w:val="center"/>
+      </w:pPr>
+      <w:r>
+        <w:rPr>
+          <w:lang w:val="en-US"/>
+        </w:rPr>
+        <w:drawing>
+          <wp:inline distT="0" distB="0" distL="0" distR="0" wp14:anchorId="3267B028" wp14:editId="28507EA7">
+            <wp:extent cx="2958790" cy="932718"/>
+            <wp:effectExtent l="0" t="0" r="0" b="1270"/>
+            <wp:docPr id="590442627" name="Picture 1"/>
+            <wp:cNvGraphicFramePr>
+              <a:graphicFrameLocks xmlns:a="http://schemas.openxmlformats.org/drawingml/2006/main" noChangeAspect="1"/>
+            </wp:cNvGraphicFramePr>
+            <a:graphic xmlns:a="http://schemas.openxmlformats.org/drawingml/2006/main">
+              <a:graphicData uri="http://schemas.openxmlformats.org/drawingml/2006/picture">
+                <pic:pic xmlns:pic="http://schemas.openxmlformats.org/drawingml/2006/picture">
+                  <pic:nvPicPr>
+                    <pic:cNvPr id="590442627" name=""/>
+                    <pic:cNvPicPr/>
+                  </pic:nvPicPr>
+                  <pic:blipFill>
+                    <a:blip r:embed="rId9"/>
+                    <a:stretch>
+                      <a:fillRect/>
+                    </a:stretch>
+                  </pic:blipFill>
+                  <pic:spPr>
+                    <a:xfrm>
+                      <a:off x="0" y="0"/>
+                      <a:ext cx="2984966" cy="940970"/>
+                    </a:xfrm>
+                    <a:prstGeom prst="rect">
+                      <a:avLst/>
+                    </a:prstGeom>
+                  </pic:spPr>
+                </pic:pic>
+              </a:graphicData>
+            </a:graphic>
+          </wp:inline>
+        </w:drawing>
+      </w:r>
+    </w:p>
+    <w:p>
+      <w:pPr>
+        <w:pStyle w:val="Caption"/>
+        <w:jc w:val="center"/>
+        <w:rPr>
+          <w:lang w:val="en-US"/>
+        </w:rPr>
+      </w:pPr>
+      <w:r>
+        <w:t xml:space="preserve">Figure </w:t>
+      </w:r>
+      <w:r>
+        <w:fldChar w:fldCharType="begin"/>
+      </w:r>
+      <w:r>
+        <w:instrText xml:space="preserve"> STYLEREF 1 \s </w:instrText>
+      </w:r>
+      <w:r>
+        <w:fldChar w:fldCharType="separate"/>
+      </w:r>
+      <w:r>
+        <w:rPr>
+          <w:noProof/>
+        </w:rPr>
+        <w:t>6</w:t>
+      </w:r>
+      <w:r>
+        <w:fldChar w:fldCharType="end"/>
+      </w:r>
+      <w:r>
+        <w:t>.</w:t>
+      </w:r>
+      <w:r>
+        <w:fldChar w:fldCharType="begin"/>
+      </w:r>
+      <w:r>
+        <w:instrText xml:space="preserve"> SEQ Figure \* ARABIC \s 1 </w:instrText>
+      </w:r>
+      <w:r>
+        <w:fldChar w:fldCharType="separate"/>
+      </w:r>
+      <w:r>
+        <w:rPr>
+          <w:noProof/>
+        </w:rPr>
+        <w:t>2</w:t>
+      </w:r>
+      <w:r>
+        <w:fldChar w:fldCharType="end"/>
+      </w:r>
+      <w:r>
+        <w:t xml:space="preserve">- </w:t>
+      </w:r>
+      <w:r>
+        <w:t>Mobile</w:t>
+      </w:r>
+      <w:r>
+        <w:t xml:space="preserve"> Lighthouse Test</w:t>
+      </w:r>
+    </w:p>
+    <w:p>
+      <w:pPr>
         <w:pStyle w:val="Heading1"/>
         <w:rPr>
           <w:rFonts w:ascii="Times New Roman" w:hAnsi="Times New Roman" w:cs="Times New Roman"/>
           <w:lang w:val="en-US"/>
         </w:rPr>
       </w:pPr>
-      <w:bookmarkStart w:id="9" w:name="_Toc225434899"/>
-      <w:r>
-        <w:rPr>
-          <w:rFonts w:ascii="Times New Roman" w:hAnsi="Times New Roman" w:cs="Times New Roman"/>
-          <w:lang w:val="en-US"/>
-        </w:rPr>
-        <w:t>Testing</w:t>
+      <w:bookmarkStart w:id="9" w:name="_Toc225443463"/>
+      <w:r>
+        <w:rPr>
+          <w:rFonts w:ascii="Times New Roman" w:hAnsi="Times New Roman" w:cs="Times New Roman"/>
+          <w:lang w:val="en-US"/>
+        </w:rPr>
+        <w:t>Security</w:t>
       </w:r>
       <w:bookmarkEnd w:id="9"/>
     </w:p>
     <w:p>
       <w:pPr>
+        <w:rPr>
+          <w:lang w:val="en-US"/>
+        </w:rPr>
+      </w:pPr>
+      <w:r>
+        <w:rPr>
+          <w:lang w:val="en-US"/>
+        </w:rPr>
+        <w:t xml:space="preserve">Most if not all security measures implemented into the application have been created from Django, as it provides CSFR protection, user authentication, SQL injection prevention, </w:t>
+      </w:r>
+      <w:r>
+        <w:rPr>
+          <w:lang w:val="en-US"/>
+        </w:rPr>
+        <w:t>and more.</w:t>
+      </w:r>
+      <w:r>
+        <w:rPr>
+          <w:lang w:val="en-US"/>
+        </w:rPr>
+        <w:t xml:space="preserve"> Using </w:t>
+      </w:r>
+      <w:r>
+        <w:rPr>
+          <w:lang w:val="en-US"/>
+        </w:rPr>
+        <w:t>Django</w:t>
+      </w:r>
+      <w:r>
+        <w:rPr>
+          <w:lang w:val="en-US"/>
+        </w:rPr>
+        <w:t xml:space="preserve"> user authentication, it allows the system </w:t>
+      </w:r>
+      <w:r>
+        <w:rPr>
+          <w:lang w:val="en-US"/>
+        </w:rPr>
+        <w:t>to hide</w:t>
+      </w:r>
+      <w:r>
+        <w:rPr>
+          <w:lang w:val="en-US"/>
+        </w:rPr>
+        <w:t xml:space="preserve"> all bookings unless they are the correct user.</w:t>
+      </w:r>
+    </w:p>
+    <w:p>
+      <w:pPr>
         <w:pStyle w:val="Heading1"/>
         <w:rPr>
           <w:rFonts w:ascii="Times New Roman" w:hAnsi="Times New Roman" w:cs="Times New Roman"/>
           <w:lang w:val="en-US"/>
         </w:rPr>
       </w:pPr>
-      <w:bookmarkStart w:id="10" w:name="_Toc225434900"/>
-      <w:r>
-        <w:rPr>
-          <w:rFonts w:ascii="Times New Roman" w:hAnsi="Times New Roman" w:cs="Times New Roman"/>
-          <w:lang w:val="en-US"/>
-        </w:rPr>
-        <w:t>Security</w:t>
+      <w:bookmarkStart w:id="10" w:name="_Toc225443464"/>
+      <w:r>
+        <w:rPr>
+          <w:rFonts w:ascii="Times New Roman" w:hAnsi="Times New Roman" w:cs="Times New Roman"/>
+          <w:lang w:val="en-US"/>
+        </w:rPr>
+        <w:t>DevOps</w:t>
       </w:r>
       <w:bookmarkEnd w:id="10"/>
     </w:p>
     <w:p>
       <w:pPr>
+        <w:rPr>
+          <w:lang w:val="en-US"/>
+        </w:rPr>
+      </w:pPr>
+      <w:r>
+        <w:rPr>
+          <w:lang w:val="en-US"/>
+        </w:rPr>
+        <w:t>DevOps is a collaborative methodology that integrates both development and operations to deliver software faster and more efficiently.</w:t>
+      </w:r>
+      <w:r>
+        <w:rPr>
+          <w:lang w:val="en-US"/>
+        </w:rPr>
+        <w:t xml:space="preserve"> There is high importance </w:t>
+      </w:r>
+      <w:proofErr w:type="gramStart"/>
+      <w:r>
+        <w:rPr>
+          <w:lang w:val="en-US"/>
+        </w:rPr>
+        <w:t>on</w:t>
+      </w:r>
+      <w:proofErr w:type="gramEnd"/>
+      <w:r>
+        <w:rPr>
+          <w:lang w:val="en-US"/>
+        </w:rPr>
+        <w:t xml:space="preserve"> automation and task tracking, making sure that updates are continuously being integrated</w:t>
+      </w:r>
+    </w:p>
+    <w:p>
+      <w:pPr>
+        <w:rPr>
+          <w:lang w:val="en-US"/>
+        </w:rPr>
+      </w:pPr>
+      <w:r>
+        <w:rPr>
+          <w:lang w:val="en-US"/>
+        </w:rPr>
+        <w:t xml:space="preserve">Some applications including draw.io, GitHub and </w:t>
+      </w:r>
+      <w:proofErr w:type="spellStart"/>
+      <w:r>
+        <w:rPr>
+          <w:lang w:val="en-US"/>
+        </w:rPr>
+        <w:t>UptimeRobot</w:t>
+      </w:r>
+      <w:proofErr w:type="spellEnd"/>
+      <w:r>
+        <w:rPr>
+          <w:lang w:val="en-US"/>
+        </w:rPr>
+        <w:t xml:space="preserve"> have been used for the DevOps cycle to plan, code and monitor the system. Draw.io and </w:t>
+      </w:r>
+      <w:proofErr w:type="spellStart"/>
+      <w:r>
+        <w:rPr>
+          <w:lang w:val="en-US"/>
+        </w:rPr>
+        <w:t>canva</w:t>
+      </w:r>
+      <w:proofErr w:type="spellEnd"/>
+      <w:r>
+        <w:rPr>
+          <w:lang w:val="en-US"/>
+        </w:rPr>
+        <w:t xml:space="preserve"> were used to create all the diagrams such as the ERD or the flow diagram. All the code was uploaded to GitHub, maintaining version control</w:t>
+      </w:r>
+      <w:r>
+        <w:rPr>
+          <w:lang w:val="en-US"/>
+        </w:rPr>
+        <w:t xml:space="preserve"> and making the work visible. The flow of work is increased by making the work visible </w:t>
+      </w:r>
+      <w:r>
+        <w:rPr>
+          <w:i/>
+          <w:iCs/>
+          <w:lang w:val="en-US"/>
+        </w:rPr>
+        <w:t>(The DevOps Handbook, 2021</w:t>
+      </w:r>
+      <w:r>
+        <w:rPr>
+          <w:i/>
+          <w:iCs/>
+          <w:lang w:val="en-US"/>
+        </w:rPr>
+        <w:t>, pp. 43-44</w:t>
+      </w:r>
+      <w:r>
+        <w:rPr>
+          <w:i/>
+          <w:iCs/>
+          <w:lang w:val="en-US"/>
+        </w:rPr>
+        <w:t>)</w:t>
+      </w:r>
+      <w:r>
+        <w:rPr>
+          <w:lang w:val="en-US"/>
+        </w:rPr>
+        <w:t>.</w:t>
+      </w:r>
+      <w:r>
+        <w:rPr>
+          <w:lang w:val="en-US"/>
+        </w:rPr>
+        <w:t xml:space="preserve"> With the deployment of the system handled by Render and live monitoring of the site performed by </w:t>
+      </w:r>
+      <w:proofErr w:type="spellStart"/>
+      <w:r>
+        <w:rPr>
+          <w:lang w:val="en-US"/>
+        </w:rPr>
+        <w:t>UptimeRobot</w:t>
+      </w:r>
+      <w:proofErr w:type="spellEnd"/>
+      <w:r>
+        <w:rPr>
+          <w:lang w:val="en-US"/>
+        </w:rPr>
+        <w:t>, the site shows very good performance.</w:t>
+      </w:r>
+      <w:r>
+        <w:rPr>
+          <w:lang w:val="en-US"/>
+        </w:rPr>
+        <w:t xml:space="preserve"> Furthermore, Render automatically deploys the main branch of GitHub on each push, meaning the Continuous Integration and Continuous Deployment or CI/CD is greatly achieved.</w:t>
+      </w:r>
+    </w:p>
+    <w:p>
+      <w:pPr>
+        <w:keepNext/>
+      </w:pPr>
+      <w:r>
+        <w:rPr>
+          <w:noProof/>
+          <w:lang w:val="en-US"/>
+        </w:rPr>
+        <w:lastRenderedPageBreak/>
+        <w:drawing>
+          <wp:inline distT="0" distB="0" distL="0" distR="0" wp14:anchorId="3FA7A40F" wp14:editId="567BFD27">
+            <wp:extent cx="5731510" cy="1576070"/>
+            <wp:effectExtent l="0" t="0" r="2540" b="5080"/>
+            <wp:docPr id="597774053" name="Picture 1"/>
+            <wp:cNvGraphicFramePr>
+              <a:graphicFrameLocks xmlns:a="http://schemas.openxmlformats.org/drawingml/2006/main" noChangeAspect="1"/>
+            </wp:cNvGraphicFramePr>
+            <a:graphic xmlns:a="http://schemas.openxmlformats.org/drawingml/2006/main">
+              <a:graphicData uri="http://schemas.openxmlformats.org/drawingml/2006/picture">
+                <pic:pic xmlns:pic="http://schemas.openxmlformats.org/drawingml/2006/picture">
+                  <pic:nvPicPr>
+                    <pic:cNvPr id="597774053" name="Picture 597774053"/>
+                    <pic:cNvPicPr/>
+                  </pic:nvPicPr>
+                  <pic:blipFill>
+                    <a:blip r:embed="rId10">
+                      <a:extLst>
+                        <a:ext uri="{28A0092B-C50C-407E-A947-70E740481C1C}">
+                          <a14:useLocalDpi xmlns:a14="http://schemas.microsoft.com/office/drawing/2010/main" val="0"/>
+                        </a:ext>
+                      </a:extLst>
+                    </a:blip>
+                    <a:stretch>
+                      <a:fillRect/>
+                    </a:stretch>
+                  </pic:blipFill>
+                  <pic:spPr>
+                    <a:xfrm>
+                      <a:off x="0" y="0"/>
+                      <a:ext cx="5731510" cy="1576070"/>
+                    </a:xfrm>
+                    <a:prstGeom prst="rect">
+                      <a:avLst/>
+                    </a:prstGeom>
+                  </pic:spPr>
+                </pic:pic>
+              </a:graphicData>
+            </a:graphic>
+          </wp:inline>
+        </w:drawing>
+      </w:r>
+    </w:p>
+    <w:p>
+      <w:pPr>
+        <w:pStyle w:val="Caption"/>
+        <w:jc w:val="center"/>
+        <w:rPr>
+          <w:lang w:val="en-US"/>
+        </w:rPr>
+      </w:pPr>
+      <w:r>
+        <w:t xml:space="preserve">Figure </w:t>
+      </w:r>
+      <w:r>
+        <w:fldChar w:fldCharType="begin"/>
+      </w:r>
+      <w:r>
+        <w:instrText xml:space="preserve"> STYLEREF 1 \s </w:instrText>
+      </w:r>
+      <w:r>
+        <w:fldChar w:fldCharType="separate"/>
+      </w:r>
+      <w:r>
+        <w:rPr>
+          <w:noProof/>
+        </w:rPr>
+        <w:t>8</w:t>
+      </w:r>
+      <w:r>
+        <w:fldChar w:fldCharType="end"/>
+      </w:r>
+      <w:r>
+        <w:t>.</w:t>
+      </w:r>
+      <w:r>
+        <w:fldChar w:fldCharType="begin"/>
+      </w:r>
+      <w:r>
+        <w:instrText xml:space="preserve"> SEQ Figure \* ARABIC \s 1 </w:instrText>
+      </w:r>
+      <w:r>
+        <w:fldChar w:fldCharType="separate"/>
+      </w:r>
+      <w:r>
+        <w:rPr>
+          <w:noProof/>
+        </w:rPr>
+        <w:t>1</w:t>
+      </w:r>
+      <w:r>
+        <w:fldChar w:fldCharType="end"/>
+      </w:r>
+      <w:r>
+        <w:t xml:space="preserve"> - </w:t>
+      </w:r>
+      <w:proofErr w:type="spellStart"/>
+      <w:r>
+        <w:t>UptimeRobot</w:t>
+      </w:r>
+      <w:proofErr w:type="spellEnd"/>
+      <w:r>
+        <w:t xml:space="preserve"> monitoring</w:t>
+      </w:r>
+    </w:p>
+    <w:p>
+      <w:pPr>
         <w:pStyle w:val="Heading1"/>
         <w:rPr>
           <w:rFonts w:ascii="Times New Roman" w:hAnsi="Times New Roman" w:cs="Times New Roman"/>
           <w:lang w:val="en-US"/>
         </w:rPr>
       </w:pPr>
-      <w:bookmarkStart w:id="11" w:name="_Toc225434901"/>
-      <w:r>
-        <w:rPr>
-          <w:rFonts w:ascii="Times New Roman" w:hAnsi="Times New Roman" w:cs="Times New Roman"/>
-          <w:lang w:val="en-US"/>
-        </w:rPr>
-        <w:t>DevOps</w:t>
+      <w:bookmarkStart w:id="11" w:name="_Toc225443465"/>
+      <w:r>
+        <w:rPr>
+          <w:rFonts w:ascii="Times New Roman" w:hAnsi="Times New Roman" w:cs="Times New Roman"/>
+          <w:lang w:val="en-US"/>
+        </w:rPr>
+        <w:t>References</w:t>
       </w:r>
       <w:bookmarkEnd w:id="11"/>
     </w:p>
     <w:p>
       <w:pPr>
-        <w:pStyle w:val="Heading1"/>
-        <w:rPr>
-          <w:rFonts w:ascii="Times New Roman" w:hAnsi="Times New Roman" w:cs="Times New Roman"/>
-          <w:lang w:val="en-US"/>
-        </w:rPr>
-      </w:pPr>
-      <w:bookmarkStart w:id="12" w:name="_Toc225434902"/>
-      <w:r>
-        <w:rPr>
-          <w:rFonts w:ascii="Times New Roman" w:hAnsi="Times New Roman" w:cs="Times New Roman"/>
-          <w:lang w:val="en-US"/>
-        </w:rPr>
-        <w:t>References</w:t>
-      </w:r>
-      <w:bookmarkEnd w:id="12"/>
+        <w:rPr>
+          <w:lang w:val="en-US"/>
+        </w:rPr>
+      </w:pPr>
     </w:p>
     <w:p>
       <w:pPr>
-        <w:pStyle w:val="Heading1"/>
-        <w:rPr>
-          <w:rFonts w:ascii="Times New Roman" w:hAnsi="Times New Roman" w:cs="Times New Roman"/>
-          <w:lang w:val="en-US"/>
-        </w:rPr>
-      </w:pPr>
-      <w:r>
-        <w:rPr>
-          <w:rFonts w:ascii="Times New Roman" w:hAnsi="Times New Roman" w:cs="Times New Roman"/>
-          <w:lang w:val="en-US"/>
-        </w:rPr>
-        <w:t>Appendices</w:t>
+        <w:rPr>
+          <w:rFonts w:ascii="Times New Roman" w:hAnsi="Times New Roman" w:cs="Times New Roman"/>
+        </w:rPr>
+      </w:pPr>
+      <w:r>
+        <w:rPr>
+          <w:rFonts w:ascii="Times New Roman" w:hAnsi="Times New Roman" w:cs="Times New Roman"/>
+        </w:rPr>
+        <w:t xml:space="preserve">Django Documentation (2026) </w:t>
+      </w:r>
+      <w:r>
+        <w:rPr>
+          <w:rFonts w:ascii="Times New Roman" w:hAnsi="Times New Roman" w:cs="Times New Roman"/>
+          <w:i/>
+          <w:iCs/>
+        </w:rPr>
+        <w:t>Testing</w:t>
+      </w:r>
+      <w:r>
+        <w:rPr>
+          <w:rFonts w:ascii="Times New Roman" w:hAnsi="Times New Roman" w:cs="Times New Roman"/>
+        </w:rPr>
+        <w:t xml:space="preserve">. Available at: </w:t>
+      </w:r>
+      <w:hyperlink r:id="rId11" w:history="1">
+        <w:r>
+          <w:rPr>
+            <w:rStyle w:val="Hyperlink"/>
+            <w:rFonts w:ascii="Times New Roman" w:hAnsi="Times New Roman" w:cs="Times New Roman"/>
+          </w:rPr>
+          <w:t>https://docs.djangoproject.com/en/6.0/topics/testing/overview/</w:t>
+        </w:r>
+      </w:hyperlink>
+      <w:r>
+        <w:rPr>
+          <w:rFonts w:ascii="Times New Roman" w:hAnsi="Times New Roman" w:cs="Times New Roman"/>
+        </w:rPr>
+        <w:t xml:space="preserve"> (Accessed: 25 June 2026)</w:t>
       </w:r>
     </w:p>
     <w:p>
       <w:pPr>
-        <w:pStyle w:val="Title"/>
-        <w:jc w:val="center"/>
-        <w:rPr>
-          <w:rFonts w:ascii="Times New Roman" w:hAnsi="Times New Roman" w:cs="Times New Roman"/>
-        </w:rPr>
-      </w:pPr>
-      <w:r>
-        <w:rPr>
-          <w:rFonts w:ascii="Times New Roman" w:hAnsi="Times New Roman" w:cs="Times New Roman"/>
-        </w:rPr>
-        <w:t>Appendix A</w:t>
-      </w:r>
+        <w:rPr>
+          <w:rFonts w:ascii="Times New Roman" w:hAnsi="Times New Roman" w:cs="Times New Roman"/>
+        </w:rPr>
+      </w:pPr>
     </w:p>
     <w:p>
       <w:pPr>
         <w:rPr>
           <w:rFonts w:ascii="Times New Roman" w:hAnsi="Times New Roman" w:cs="Times New Roman"/>
-        </w:rPr>
-      </w:pPr>
-      <w:r>
-        <w:rPr>
-          <w:rFonts w:ascii="Times New Roman" w:hAnsi="Times New Roman" w:cs="Times New Roman"/>
-        </w:rPr>
-        <w:t>Example text</w:t>
-      </w:r>
-    </w:p>
-    <w:p>
-      <w:pPr>
-        <w:rPr>
-          <w:rFonts w:ascii="Times New Roman" w:hAnsi="Times New Roman" w:cs="Times New Roman"/>
-          <w:lang w:val="en-US"/>
-        </w:rPr>
-      </w:pPr>
+          <w:lang w:val="en-US"/>
+        </w:rPr>
+      </w:pPr>
+      <w:r>
+        <w:rPr>
+          <w:rFonts w:ascii="Times New Roman" w:hAnsi="Times New Roman" w:cs="Times New Roman"/>
+        </w:rPr>
+        <w:t xml:space="preserve">Kim, G. (2021) The DevOps Handbook, Second Edition: How to Create World-Class Agility, Reliability, &amp; Security in Technology Organizations. Available at: </w:t>
+      </w:r>
+      <w:hyperlink r:id="rId12" w:history="1">
+        <w:r>
+          <w:rPr>
+            <w:rStyle w:val="Hyperlink"/>
+            <w:rFonts w:ascii="Times New Roman" w:hAnsi="Times New Roman" w:cs="Times New Roman"/>
+          </w:rPr>
+          <w:t>https://r3.vlebooks.com/EpubReader?ean=1781950508433#</w:t>
+        </w:r>
+      </w:hyperlink>
+      <w:r>
+        <w:rPr>
+          <w:rFonts w:ascii="Times New Roman" w:hAnsi="Times New Roman" w:cs="Times New Roman"/>
+        </w:rPr>
+        <w:t xml:space="preserve"> (Accessed: 26 June 2026)</w:t>
+      </w:r>
     </w:p>
     <w:sectPr>
       <w:pgSz w:w="11906" w:h="16838"/>
@@ -8663,6 +9614,37 @@
       <w:spacing w:val="5"/>
     </w:rPr>
   </w:style>
+  <w:style w:type="paragraph" w:styleId="Caption">
+    <w:name w:val="caption"/>
+    <w:basedOn w:val="Normal"/>
+    <w:next w:val="Normal"/>
+    <w:uiPriority w:val="35"/>
+    <w:unhideWhenUsed/>
+    <w:qFormat/>
+    <w:rsid w:val="005D6526"/>
+    <w:pPr>
+      <w:spacing w:after="200" w:line="240" w:lineRule="auto"/>
+    </w:pPr>
+    <w:rPr>
+      <w:i/>
+      <w:iCs/>
+      <w:color w:val="0E2841" w:themeColor="text2"/>
+      <w:sz w:val="18"/>
+      <w:szCs w:val="18"/>
+    </w:rPr>
+  </w:style>
+  <w:style w:type="character" w:styleId="UnresolvedMention">
+    <w:name w:val="Unresolved Mention"/>
+    <w:basedOn w:val="DefaultParagraphFont"/>
+    <w:uiPriority w:val="99"/>
+    <w:semiHidden/>
+    <w:unhideWhenUsed/>
+    <w:rsid w:val="008628D9"/>
+    <w:rPr>
+      <w:color w:val="605E5C"/>
+      <w:shd w:val="clear" w:color="auto" w:fill="E1DFDD"/>
+    </w:rPr>
+  </w:style>
 </w:styles>
 </file>
 

</xml_diff>